<commit_message>
docs: cap nhat tac gia thanh Dang Cuong - Thanh vien k chinh thuc trong toan bo tai lieu
</commit_message>
<xml_diff>
--- a/docs/Mo_hinh_du_bao_kinh_te_5.1_FrostLink.docx
+++ b/docs/Mo_hinh_du_bao_kinh_te_5.1_FrostLink.docx
@@ -43,6 +43,10 @@
         <w:t>Đề án: FrostLink – Nền tảng điều phối chuỗi lạnh nông sản mùa vụ (Lục Ngạn)</w:t>
         <w:br/>
         <w:t>Cuộc thi: Vietnam Young Logistics Talents (VYLT) 2026</w:t>
+      </w:r>
+      <w:r>
+        <w:br/>
+        <w:t>Tác giả: Đặng Cường - Thành viên k chính thức</w:t>
       </w:r>
     </w:p>
     <w:tbl>

</xml_diff>